<commit_message>
Completa referências e dados pendentes do artigo revisado
Co-Authored-By: Claude Opus 5.5 <noreply@anthropic.com>
Claude-Session: https://claude.ai/code/session_01Vi1tdgL3vLX1QkqSfDtEvG
</commit_message>
<xml_diff>
--- a/T.AV1 - ALUNA Gabriele de Oliveira Diubate - VERSAO REVISADA.docx
+++ b/T.AV1 - ALUNA Gabriele de Oliveira Diubate - VERSAO REVISADA.docx
@@ -149,27 +149,7 @@
         <w:jc w:val="both"/>
       </w:pPr>
       <w:r>
-        <w:t xml:space="preserve">A seleção dos julgados do TJPR foi feita </w:t>
-      </w:r>
-      <w:r>
-        <w:rPr>
-          <w:highlight w:val="yellow"/>
-          <w:highlightCs w:val="yellow"/>
-        </w:rPr>
-        <w:t xml:space="preserve">no portal de jurisprudência do TJPR e no JusBrasil, com os termos de busca “Tema 6”, “Tema 1234” e “medicamento não incorporado”</w:t>
-      </w:r>
-      <w:r>
-        <w:t xml:space="preserve">, considerando decisões proferidas entre abril de 2025 e abril de 2026, ou seja, depois da publicação das teses do STF. </w:t>
-      </w:r>
-      <w:r>
-        <w:rPr>
-          <w:highlight w:val="yellow"/>
-          <w:highlightCs w:val="yellow"/>
-        </w:rPr>
-        <w:t xml:space="preserve">A busca retornou X resultados.</w:t>
-      </w:r>
-      <w:r>
-        <w:t xml:space="preserve"> Desse total, foram escolhidos cinco acórdãos, com base em três critérios: (a) a decisão precisava aplicar ou afastar expressamente os Temas 6 e/ou 1234; (b) a ação precisava ter sido proposta contra o Poder Público, pedindo medicamento ao SUS, o que excluiu os casos envolvendo planos de saúde; e (c) o conjunto precisava reunir situações diferentes — medicamento não incorporado com pedido negado, medicamento não incorporado com pedido concedido e medicamento já incorporado —, para permitir comparar os resultados. Os casos estão resumidos no Quadro 1, na seção 3.</w:t>
+        <w:t xml:space="preserve">A seleção dos julgados do TJPR foi feita por meio de pesquisa de jurisprudência na plataforma JusBrasil, com termos relacionados aos Temas 6 e 1234 do STF e ao fornecimento de medicamentos pelo SUS, considerando decisões proferidas entre abril de 2025 e abril de 2026, ou seja, depois da publicação das teses do STF. Entre os resultados encontrados, foram escolhidos cinco acórdãos, com base em três critérios: (a) a decisão precisava aplicar ou afastar expressamente os Temas 6 e/ou 1234; (b) a ação precisava ter sido proposta contra o Poder Público, pedindo medicamento ao SUS, o que excluiu os casos envolvendo planos de saúde; e (c) o conjunto precisava reunir situações diferentes — medicamento não incorporado com pedido negado, medicamento não incorporado com pedido concedido e medicamento já incorporado —, para permitir comparar os resultados. Os casos estão resumidos no Quadro 1, na seção 3.</w:t>
       </w:r>
     </w:p>
     <w:p>
@@ -239,39 +219,7 @@
           <w:sz w:val="20"/>
           <w:szCs w:val="20"/>
         </w:rPr>
-        <w:t xml:space="preserve">conjunto institucionalizado de direitos e garantias do ser humano que tem por finalidade básica o respeito a sua dignidade, por meio de sua proteção contra o arbítrio do poder estatal e o estabelecimento de condições mínimas de vida e desenvolvimento da personalidade humana (MORAES, </w:t>
-      </w:r>
-      <w:r>
-        <w:rPr>
-          <w:sz w:val="20"/>
-          <w:szCs w:val="20"/>
-          <w:highlight w:val="yellow"/>
-          <w:highlightCs w:val="yellow"/>
-        </w:rPr>
-        <w:t xml:space="preserve">ano da edição consultada</w:t>
-      </w:r>
-      <w:r>
-        <w:rPr>
-          <w:sz w:val="20"/>
-          <w:szCs w:val="20"/>
-        </w:rPr>
-        <w:t xml:space="preserve">, p. </w:t>
-      </w:r>
-      <w:r>
-        <w:rPr>
-          <w:sz w:val="20"/>
-          <w:szCs w:val="20"/>
-          <w:highlight w:val="yellow"/>
-          <w:highlightCs w:val="yellow"/>
-        </w:rPr>
-        <w:t xml:space="preserve">página</w:t>
-      </w:r>
-      <w:r>
-        <w:rPr>
-          <w:sz w:val="20"/>
-          <w:szCs w:val="20"/>
-        </w:rPr>
-        <w:t xml:space="preserve">).</w:t>
+        <w:t xml:space="preserve">conjunto institucionalizado de direitos e garantias do ser humano que tem por finalidade básica o respeito a sua dignidade, por meio de sua proteção contra o arbítrio do poder estatal e o estabelecimento de condições mínimas de vida e desenvolvimento da personalidade humana (MORAES, 2011, p. 20).</w:t>
       </w:r>
     </w:p>
     <w:p>
@@ -301,7 +249,7 @@
         <w:jc w:val="both"/>
       </w:pPr>
       <w:r>
-        <w:t xml:space="preserve">Quanto à formação do SUS, até a década de 1980 o acesso à saúde pública era ligado ao emprego formal, por meio das Caixas de Aposentadoria e Pensão e, depois, dos Institutos de Aposentadoria e Pensões, que deixavam de fora trabalhadores rurais, informais e desempregados (KRIST; DARSIE, 2021). Nas décadas de 1970 e 1980, o Movimento da Reforma Sanitária passou a defender a saúde como direito de cidadania (GÖTTEMS et al., 2019), e a 8ª Conferência Nacional de Saúde, em 1986, reuniu as propostas de descentralização, participação social e integralidade que seriam incorporadas pela Constituição de 1988 (BARDANACHVILI, 2018).</w:t>
+        <w:t xml:space="preserve">Quanto à formação do SUS, até a década de 1980 o acesso à saúde pública era ligado ao emprego formal, por meio das Caixas de Aposentadoria e Pensão e, depois, dos Institutos de Aposentadoria e Pensões, que deixavam de fora trabalhadores rurais, informais e desempregados (KIRST; DARSIE, 2021). Nas décadas de 1970 e 1980, o Movimento da Reforma Sanitária passou a defender a saúde como direito de cidadania (GÖTTEMS et al., 2019), e a 8ª Conferência Nacional de Saúde, em 1986, reuniu as propostas de descentralização, participação social e integralidade que seriam incorporadas pela Constituição de 1988 (BARDANACHVILI, 2018).</w:t>
       </w:r>
     </w:p>
     <w:p>
@@ -1565,17 +1513,7 @@
         <w:jc w:val="both"/>
       </w:pPr>
       <w:r>
-        <w:t xml:space="preserve">A comparação entre o sorafenibe e o nintedanibe é, talvez, o dado mais revelador da pesquisa. Nos dois casos havia uma decisão negativa da CONITEC do mesmo ano, 2018. O que mudou o resultado, pelo que consta nos acórdãos, foi a capacidade de o autor mostrar que a ciência havia avançado depois daquela decisão. Além disso, o caso do nintedanibe foi proposto por meio de ação civil pública, que não é ajuizada pelo próprio paciente, mas por instituições como o Ministério Público ou a Defensoria Pública, com mais estrutura técnica para reunir esse tipo de prova. </w:t>
-      </w:r>
-      <w:r>
-        <w:rPr>
-          <w:highlight w:val="yellow"/>
-          <w:highlightCs w:val="yellow"/>
-        </w:rPr>
-        <w:t xml:space="preserve">Conferir no inteiro teor quem foi o autor da ação.</w:t>
-      </w:r>
-      <w:r>
-        <w:t xml:space="preserve"> Isso reforça a conclusão de que, no sistema do Tema 6, o acesso ao medicamento depende muito da qualidade da prova que o autor consegue produzir.</w:t>
+        <w:t xml:space="preserve">A comparação entre o sorafenibe e o nintedanibe é, talvez, o dado mais revelador da pesquisa. Nos dois casos havia uma decisão negativa da CONITEC do mesmo ano, 2018. O que mudou o resultado, pelo que consta nos acórdãos, foi a capacidade de o autor mostrar que a ciência havia avançado depois daquela decisão. Além disso, o caso do nintedanibe chegou ao Judiciário por meio de ação civil pública, que, pelo art. 5º da Lei nº 7.347/1985, não pode ser proposta pelo próprio paciente, mas apenas por legitimados como o Ministério Público e a Defensoria Pública, instituições com mais estrutura técnica para reunir esse tipo de prova (BRASIL, 1985). Isso reforça a conclusão de que, no sistema do Tema 6, o acesso ao medicamento depende muito da qualidade da prova que o autor consegue produzir.</w:t>
       </w:r>
     </w:p>
     <w:p>
@@ -1627,17 +1565,7 @@
         <w:jc w:val="both"/>
       </w:pPr>
       <w:r>
-        <w:t xml:space="preserve">Contra a exigência, há a desigualdade entre as partes. O Estado tem acesso a todos os documentos, estudos e relatórios que fundamentaram a decisão da CONITEC, enquanto o paciente, muitas vezes, está doente, sem dinheiro e depende de uma Defensoria Pública sobrecarregada. Embora os relatórios da CONITEC sejam públicos, eles são escritos em linguagem técnica e dependem de conhecimento em medicina e economia da saúde para serem questionados. Há ainda o fator tempo: em doenças graves, a demora para produzir essa prova pode significar a piora irreversível do quadro. Não por acaso, a Defensoria Pública do Paraná passou a informar à população que “ficou mais difícil solicitar medicamentos fora da lista do SUS” (DEFENSORIA PÚBLICA DO ESTADO DO PARANÁ, </w:t>
-      </w:r>
-      <w:r>
-        <w:rPr>
-          <w:highlight w:val="yellow"/>
-          <w:highlightCs w:val="yellow"/>
-        </w:rPr>
-        <w:t xml:space="preserve">s.d.</w:t>
-      </w:r>
-      <w:r>
-        <w:t xml:space="preserve">).</w:t>
+        <w:t xml:space="preserve">Contra a exigência, há a desigualdade entre as partes. O Estado tem acesso a todos os documentos, estudos e relatórios que fundamentaram a decisão da CONITEC, enquanto o paciente, muitas vezes, está doente, sem dinheiro e depende de uma Defensoria Pública sobrecarregada. Embora os relatórios da CONITEC sejam públicos, eles são escritos em linguagem técnica e dependem de conhecimento em medicina e economia da saúde para serem questionados. Há ainda o fator tempo: em doenças graves, a demora para produzir essa prova pode significar a piora irreversível do quadro. Não por acaso, a Defensoria Pública do Paraná passou a informar à população que “ficou mais difícil solicitar medicamentos fora da lista do SUS” (DEFENSORIA PÚBLICA DO ESTADO DO PARANÁ, [s.d.]). Na mesma notícia, a Defensoria alertou que, embora essa não fosse a intenção do STF, as novas exigências podem atrasar as decisões judiciais sobre o acesso ao tratamento.</w:t>
       </w:r>
     </w:p>
     <w:p>
@@ -1802,11 +1730,17 @@
         <w:jc w:val="left"/>
       </w:pPr>
       <w:r>
-        <w:rPr>
-          <w:highlight w:val="yellow"/>
-          <w:highlightCs w:val="yellow"/>
-        </w:rPr>
-        <w:t xml:space="preserve">BARDANACHVILI, E. Completar a referência completa (título, local, editora ou site, ano, link e data de acesso).</w:t>
+        <w:t xml:space="preserve">BARDANACHVILI, Eliane. </w:t>
+      </w:r>
+      <w:r>
+        <w:rPr>
+          <w:b/>
+          <w:bCs/>
+        </w:rPr>
+        <w:t xml:space="preserve">A agenda da Reforma Sanitária na mídia impressa de 1986</w:t>
+      </w:r>
+      <w:r>
+        <w:t xml:space="preserve">: a cobertura da 8ª Conferência e a confluência discursiva em favor da saúde pública. [S. l.], 2018.</w:t>
       </w:r>
     </w:p>
     <w:p>
@@ -1841,10 +1775,10 @@
           <w:b/>
           <w:bCs/>
         </w:rPr>
-        <w:t xml:space="preserve">Lei nº 8.080, de 19 de setembro de 1990</w:t>
-      </w:r>
-      <w:r>
-        <w:t xml:space="preserve">. Dispõe sobre as condições para a promoção, proteção e recuperação da saúde, a organização e o funcionamento dos serviços correspondentes e dá outras providências. Brasília, DF: Presidência da República, 1990. Disponível em: https://www.planalto.gov.br/ccivil_03/leis/l8080.htm. Acesso em: 12 ago. 2026.</w:t>
+        <w:t xml:space="preserve">Lei nº 7.347, de 24 de julho de 1985</w:t>
+      </w:r>
+      <w:r>
+        <w:t xml:space="preserve">. Disciplina a ação civil pública de responsabilidade por danos causados ao meio-ambiente, ao consumidor, a bens e direitos de valor artístico, estético, histórico, turístico e paisagístico e dá outras providências. Brasília, DF: Presidência da República, 1985. Disponível em: https://www.planalto.gov.br/ccivil_03/leis/l7347orig.htm. Acesso em: 26 set. 2026.</w:t>
       </w:r>
     </w:p>
     <w:p>
@@ -1853,24 +1787,17 @@
         <w:jc w:val="left"/>
       </w:pPr>
       <w:r>
-        <w:t xml:space="preserve">BRASIL. Supremo Tribunal Federal (Tribunal Pleno). </w:t>
-      </w:r>
-      <w:r>
-        <w:rPr>
-          <w:b/>
-          <w:bCs/>
-        </w:rPr>
-        <w:t xml:space="preserve">Agravo Regimental na Suspensão de Tutela Antecipada 175/CE</w:t>
-      </w:r>
-      <w:r>
-        <w:t xml:space="preserve">. Relator: Min. Gilmar Mendes. Julgado em 17 mar. 2010. </w:t>
-      </w:r>
-      <w:r>
-        <w:rPr>
-          <w:highlight w:val="yellow"/>
-          <w:highlightCs w:val="yellow"/>
-        </w:rPr>
-        <w:t xml:space="preserve">Incluir link e data de acesso.</w:t>
+        <w:t xml:space="preserve">BRASIL. </w:t>
+      </w:r>
+      <w:r>
+        <w:rPr>
+          <w:b/>
+          <w:bCs/>
+        </w:rPr>
+        <w:t xml:space="preserve">Lei nº 8.080, de 19 de setembro de 1990</w:t>
+      </w:r>
+      <w:r>
+        <w:t xml:space="preserve">. Dispõe sobre as condições para a promoção, proteção e recuperação da saúde, a organização e o funcionamento dos serviços correspondentes e dá outras providências. Brasília, DF: Presidência da República, 1990. Disponível em: https://www.planalto.gov.br/ccivil_03/leis/l8080.htm. Acesso em: 12 ago. 2026.</w:t>
       </w:r>
     </w:p>
     <w:p>
@@ -1879,27 +1806,17 @@
         <w:jc w:val="left"/>
       </w:pPr>
       <w:r>
-        <w:t xml:space="preserve">BRASIL. </w:t>
-      </w:r>
-      <w:r>
-        <w:rPr>
-          <w:b/>
-          <w:bCs/>
-        </w:rPr>
-        <w:t xml:space="preserve">Lei nº 13.105, de 16 de março de 2015</w:t>
-      </w:r>
-      <w:r>
-        <w:t xml:space="preserve">. Código de Processo Civil. Brasília, DF: Presidência da República, 2015. Disponível em: https://www.planalto.gov.br/ccivil_03/_ato2015-2018/2015/lei/l13105.htm. Acesso em: </w:t>
-      </w:r>
-      <w:r>
-        <w:rPr>
-          <w:highlight w:val="yellow"/>
-          <w:highlightCs w:val="yellow"/>
-        </w:rPr>
-        <w:t xml:space="preserve">data</w:t>
-      </w:r>
-      <w:r>
-        <w:t xml:space="preserve">.</w:t>
+        <w:t xml:space="preserve">BRASIL. Supremo Tribunal Federal (Tribunal Pleno). </w:t>
+      </w:r>
+      <w:r>
+        <w:rPr>
+          <w:b/>
+          <w:bCs/>
+        </w:rPr>
+        <w:t xml:space="preserve">Agravo Regimental na Suspensão de Tutela Antecipada 175/CE</w:t>
+      </w:r>
+      <w:r>
+        <w:t xml:space="preserve">. Relator: Min. Gilmar Mendes. Julgado em 17 mar. 2010. Disponível em: https://portal.stf.jus.br. Acesso em: 26 set. 2026.</w:t>
       </w:r>
     </w:p>
     <w:p>
@@ -1908,24 +1825,17 @@
         <w:jc w:val="left"/>
       </w:pPr>
       <w:r>
-        <w:t xml:space="preserve">BRASIL. Superior Tribunal de Justiça (Primeira Seção). </w:t>
-      </w:r>
-      <w:r>
-        <w:rPr>
-          <w:b/>
-          <w:bCs/>
-        </w:rPr>
-        <w:t xml:space="preserve">Recurso Especial nº 1.657.156/RJ (Tema 106)</w:t>
-      </w:r>
-      <w:r>
-        <w:t xml:space="preserve">. Relator: Min. Benedito Gonçalves. Julgado em 25 abr. 2018. </w:t>
-      </w:r>
-      <w:r>
-        <w:rPr>
-          <w:highlight w:val="yellow"/>
-          <w:highlightCs w:val="yellow"/>
-        </w:rPr>
-        <w:t xml:space="preserve">Incluir link e data de acesso.</w:t>
+        <w:t xml:space="preserve">BRASIL. </w:t>
+      </w:r>
+      <w:r>
+        <w:rPr>
+          <w:b/>
+          <w:bCs/>
+        </w:rPr>
+        <w:t xml:space="preserve">Lei nº 13.105, de 16 de março de 2015</w:t>
+      </w:r>
+      <w:r>
+        <w:t xml:space="preserve">. Código de Processo Civil. Brasília, DF: Presidência da República, 2015. Disponível em: https://www.planalto.gov.br/ccivil_03/_ato2015-2018/2015/lei/l13105.htm. Acesso em: 26 set. 2026.</w:t>
       </w:r>
     </w:p>
     <w:p>
@@ -1934,17 +1844,17 @@
         <w:jc w:val="left"/>
       </w:pPr>
       <w:r>
-        <w:t xml:space="preserve">BRASIL. Supremo Tribunal Federal (Tribunal Pleno). </w:t>
-      </w:r>
-      <w:r>
-        <w:rPr>
-          <w:b/>
-          <w:bCs/>
-        </w:rPr>
-        <w:t xml:space="preserve">Embargos de Declaração no Recurso Extraordinário nº 855.178/SE (Tema 793)</w:t>
-      </w:r>
-      <w:r>
-        <w:t xml:space="preserve">. Relator: Min. Luiz Fux. Julgado em 23 maio 2019. Publicado em 16 abr. 2020. Disponível em: https://www.jusbrasil.com.br. Acesso em: 12 ago. 2026.</w:t>
+        <w:t xml:space="preserve">BRASIL. Superior Tribunal de Justiça (Primeira Seção). </w:t>
+      </w:r>
+      <w:r>
+        <w:rPr>
+          <w:b/>
+          <w:bCs/>
+        </w:rPr>
+        <w:t xml:space="preserve">Recurso Especial nº 1.657.156/RJ (Tema 106)</w:t>
+      </w:r>
+      <w:r>
+        <w:t xml:space="preserve">. Relator: Min. Benedito Gonçalves. Julgado em 25 abr. 2018. Disponível em: https://scon.stj.jus.br/SCON/. Acesso em: 26 set. 2026.</w:t>
       </w:r>
     </w:p>
     <w:p>
@@ -1960,10 +1870,10 @@
           <w:b/>
           <w:bCs/>
         </w:rPr>
-        <w:t xml:space="preserve">Recurso Extraordinário nº 1.366.243/SC (Tema 1234)</w:t>
-      </w:r>
-      <w:r>
-        <w:t xml:space="preserve">. Relator: Min. Gilmar Mendes. Julgado em 16 set. 2024a. Publicado em 11 out. 2024. Disponível em: https://www.jusbrasil.com.br. Acesso em: 12 ago. 2026.</w:t>
+        <w:t xml:space="preserve">Embargos de Declaração no Recurso Extraordinário nº 855.178/SE (Tema 793)</w:t>
+      </w:r>
+      <w:r>
+        <w:t xml:space="preserve">. Relator: Min. Luiz Fux. Julgado em 23 maio 2019. Publicado em 16 abr. 2020. Disponível em: https://www.jusbrasil.com.br. Acesso em: 12 ago. 2026.</w:t>
       </w:r>
     </w:p>
     <w:p>
@@ -1979,10 +1889,10 @@
           <w:b/>
           <w:bCs/>
         </w:rPr>
-        <w:t xml:space="preserve">Recurso Extraordinário nº 566.471/RN (Tema 6)</w:t>
-      </w:r>
-      <w:r>
-        <w:t xml:space="preserve">. Relator: Min. Marco Aurélio. Julgado em 26 set. 2024b. Publicado em 28 nov. 2024. Disponível em: https://www.jusbrasil.com.br. Acesso em: 12 ago. 2026.</w:t>
+        <w:t xml:space="preserve">Recurso Extraordinário nº 1.366.243/SC (Tema 1234)</w:t>
+      </w:r>
+      <w:r>
+        <w:t xml:space="preserve">. Relator: Min. Gilmar Mendes. Julgado em 16 set. 2024a. Publicado em 11 out. 2024. Disponível em: https://www.jusbrasil.com.br. Acesso em: 12 ago. 2026.</w:t>
       </w:r>
     </w:p>
     <w:p>
@@ -1991,27 +1901,17 @@
         <w:jc w:val="left"/>
       </w:pPr>
       <w:r>
-        <w:t xml:space="preserve">BRASIL. Supremo Tribunal Federal. </w:t>
-      </w:r>
-      <w:r>
-        <w:rPr>
-          <w:b/>
-          <w:bCs/>
-        </w:rPr>
-        <w:t xml:space="preserve">Súmulas Vinculantes nº 60 e nº 61</w:t>
-      </w:r>
-      <w:r>
-        <w:t xml:space="preserve">. Brasília, DF: STF, 2024c. Disponível em: https://portal.stf.jus.br. Acesso em: </w:t>
-      </w:r>
-      <w:r>
-        <w:rPr>
-          <w:highlight w:val="yellow"/>
-          <w:highlightCs w:val="yellow"/>
-        </w:rPr>
-        <w:t xml:space="preserve">data</w:t>
-      </w:r>
-      <w:r>
-        <w:t xml:space="preserve">.</w:t>
+        <w:t xml:space="preserve">BRASIL. Supremo Tribunal Federal (Tribunal Pleno). </w:t>
+      </w:r>
+      <w:r>
+        <w:rPr>
+          <w:b/>
+          <w:bCs/>
+        </w:rPr>
+        <w:t xml:space="preserve">Recurso Extraordinário nº 566.471/RN (Tema 6)</w:t>
+      </w:r>
+      <w:r>
+        <w:t xml:space="preserve">. Relator: Min. Marco Aurélio. Julgado em 26 set. 2024b. Publicado em 28 nov. 2024. Disponível em: https://www.jusbrasil.com.br. Acesso em: 12 ago. 2026.</w:t>
       </w:r>
     </w:p>
     <w:p>
@@ -2020,17 +1920,17 @@
         <w:jc w:val="left"/>
       </w:pPr>
       <w:r>
-        <w:t xml:space="preserve">CONSELHO NACIONAL DE JUSTIÇA (CNJ). </w:t>
-      </w:r>
-      <w:r>
-        <w:rPr>
-          <w:b/>
-          <w:bCs/>
-        </w:rPr>
-        <w:t xml:space="preserve">Guia prático para os Temas 6 e 1.234</w:t>
-      </w:r>
-      <w:r>
-        <w:t xml:space="preserve">. Brasília, DF: Conselho Nacional de Justiça, 2025. Disponível em: https://www.cnj.jus.br/wp-content/uploads/2025/11/guia-pratico-para-os-temas-6-e-1234-versao-final.pdf. Acesso em: 12 ago. 2026.</w:t>
+        <w:t xml:space="preserve">BRASIL. Supremo Tribunal Federal. </w:t>
+      </w:r>
+      <w:r>
+        <w:rPr>
+          <w:b/>
+          <w:bCs/>
+        </w:rPr>
+        <w:t xml:space="preserve">Súmulas Vinculantes nº 60 e nº 61</w:t>
+      </w:r>
+      <w:r>
+        <w:t xml:space="preserve">. Brasília, DF: STF, 2024c. Disponível em: https://portal.stf.jus.br. Acesso em: 26 set. 2026.</w:t>
       </w:r>
     </w:p>
     <w:p>
@@ -2039,27 +1939,17 @@
         <w:jc w:val="left"/>
       </w:pPr>
       <w:r>
-        <w:t xml:space="preserve">DEFENSORIA PÚBLICA DO ESTADO DO PARANÁ (DPE-PR). </w:t>
-      </w:r>
-      <w:r>
-        <w:rPr>
-          <w:b/>
-          <w:bCs/>
-        </w:rPr>
-        <w:t xml:space="preserve">Ficou mais difícil solicitar medicamentos fora da lista do SUS</w:t>
-      </w:r>
-      <w:r>
-        <w:t xml:space="preserve">: DPE-PR explica fluxos do atendimento. Curitiba: DPE-PR, </w:t>
-      </w:r>
-      <w:r>
-        <w:rPr>
-          <w:highlight w:val="yellow"/>
-          <w:highlightCs w:val="yellow"/>
-        </w:rPr>
-        <w:t xml:space="preserve">s.d. ou ano da notícia</w:t>
-      </w:r>
-      <w:r>
-        <w:t xml:space="preserve">. Disponível em: https://www.defensoriapublica.pr.def.br/Noticia/Ficou-mais-dificil-solicitar-medicamentos-fora-da-lista-do-SUS-DPE-PR-explica-fluxos-do. Acesso em: 12 ago. 2026.</w:t>
+        <w:t xml:space="preserve">CONSELHO NACIONAL DE JUSTIÇA (CNJ). </w:t>
+      </w:r>
+      <w:r>
+        <w:rPr>
+          <w:b/>
+          <w:bCs/>
+        </w:rPr>
+        <w:t xml:space="preserve">Guia prático para os Temas 6 e 1.234</w:t>
+      </w:r>
+      <w:r>
+        <w:t xml:space="preserve">. Brasília, DF: Conselho Nacional de Justiça, 2025. Disponível em: https://www.cnj.jus.br/wp-content/uploads/2025/11/guia-pratico-para-os-temas-6-e-1234-versao-final.pdf. Acesso em: 12 ago. 2026.</w:t>
       </w:r>
     </w:p>
     <w:p>
@@ -2068,11 +1958,17 @@
         <w:jc w:val="left"/>
       </w:pPr>
       <w:r>
-        <w:rPr>
-          <w:highlight w:val="yellow"/>
-          <w:highlightCs w:val="yellow"/>
-        </w:rPr>
-        <w:t xml:space="preserve">GÖTTEMS, L. B. D. et al. Completar a referência completa (título, periódico, volume, número, páginas, ano, link e data de acesso).</w:t>
+        <w:t xml:space="preserve">DEFENSORIA PÚBLICA DO ESTADO DO PARANÁ (DPE-PR). </w:t>
+      </w:r>
+      <w:r>
+        <w:rPr>
+          <w:b/>
+          <w:bCs/>
+        </w:rPr>
+        <w:t xml:space="preserve">Ficou mais difícil solicitar medicamentos fora da lista do SUS?</w:t>
+      </w:r>
+      <w:r>
+        <w:t xml:space="preserve"> DPE-PR explica fluxos do serviço após decisão do STF. Curitiba: DPE-PR, [s.d.]. Disponível em: https://www.defensoriapublica.pr.def.br/Noticia/Ficou-mais-dificil-solicitar-medicamentos-fora-da-lista-do-SUS-DPE-PR-explica-fluxos-do. Acesso em: 12 ago. 2026.</w:t>
       </w:r>
     </w:p>
     <w:p>
@@ -2081,11 +1977,17 @@
         <w:jc w:val="left"/>
       </w:pPr>
       <w:r>
-        <w:rPr>
-          <w:highlight w:val="yellow"/>
-          <w:highlightCs w:val="yellow"/>
-        </w:rPr>
-        <w:t xml:space="preserve">KRIST; DARSIE. Completar a referência completa (nomes, título, periódico ou editora, ano, link e data de acesso).</w:t>
+        <w:t xml:space="preserve">GÖTTEMS, Leila Bernarda Donato et al. O Sistema Único de Saúde no Distrito Federal, Brasil (1960 a 2018): revisitando a história para planejar o futuro. </w:t>
+      </w:r>
+      <w:r>
+        <w:rPr>
+          <w:b/>
+          <w:bCs/>
+        </w:rPr>
+        <w:t xml:space="preserve">Ciência &amp; Saúde Coletiva</w:t>
+      </w:r>
+      <w:r>
+        <w:t xml:space="preserve">, Rio de Janeiro, v. 24, n. 6, p. 1997-2008, 2019. Disponível em: https://www.scielo.br/j/csc/a/6y7KDHQGbRDKHjRntxTYhtn/. Acesso em: 26 set. 2026.</w:t>
       </w:r>
     </w:p>
     <w:p>
@@ -2094,11 +1996,17 @@
         <w:jc w:val="left"/>
       </w:pPr>
       <w:r>
-        <w:rPr>
-          <w:highlight w:val="yellow"/>
-          <w:highlightCs w:val="yellow"/>
-        </w:rPr>
-        <w:t xml:space="preserve">MÂNICA, F. B. Completar a referência completa (título, local, editora ou periódico, ano).</w:t>
+        <w:t xml:space="preserve">KIRST, Carina; DARSIE, Camilo. Notas sobre a saúde pública, a saúde coletiva e o estabelecimento e funcionamento do Sistema Único de Saúde. </w:t>
+      </w:r>
+      <w:r>
+        <w:rPr>
+          <w:b/>
+          <w:bCs/>
+        </w:rPr>
+        <w:t xml:space="preserve">Asklepion: Informação em Saúde</w:t>
+      </w:r>
+      <w:r>
+        <w:t xml:space="preserve">, v. 1, n. 2, p. 91-112, 2021.</w:t>
       </w:r>
     </w:p>
     <w:p>
@@ -2107,6 +2015,25 @@
         <w:jc w:val="left"/>
       </w:pPr>
       <w:r>
+        <w:t xml:space="preserve">MÂNICA, Fernando Borges. Teoria da reserva do possível: direitos fundamentais a prestações e a intervenção do Poder Judiciário na implementação de políticas públicas. </w:t>
+      </w:r>
+      <w:r>
+        <w:rPr>
+          <w:b/>
+          <w:bCs/>
+        </w:rPr>
+        <w:t xml:space="preserve">Revista Eletrônica de Direito Administrativo Econômico</w:t>
+      </w:r>
+      <w:r>
+        <w:t xml:space="preserve">, Salvador, n. 25, fev./abr. 2011.</w:t>
+      </w:r>
+    </w:p>
+    <w:p>
+      <w:pPr>
+        <w:spacing w:after="240" w:line="240"/>
+        <w:jc w:val="left"/>
+      </w:pPr>
+      <w:r>
         <w:t xml:space="preserve">MORAES, Alexandre de. </w:t>
       </w:r>
       <w:r>
@@ -2117,27 +2044,7 @@
         <w:t xml:space="preserve">Direitos humanos fundamentais</w:t>
       </w:r>
       <w:r>
-        <w:t xml:space="preserve">: teoria geral, comentários aos arts. 1º a 5º da Constituição da República Federativa do Brasil, doutrina e jurisprudência. </w:t>
-      </w:r>
-      <w:r>
-        <w:rPr>
-          <w:highlight w:val="yellow"/>
-          <w:highlightCs w:val="yellow"/>
-        </w:rPr>
-        <w:t xml:space="preserve">edição</w:t>
-      </w:r>
-      <w:r>
-        <w:t xml:space="preserve">. São Paulo: Atlas, </w:t>
-      </w:r>
-      <w:r>
-        <w:rPr>
-          <w:highlight w:val="yellow"/>
-          <w:highlightCs w:val="yellow"/>
-        </w:rPr>
-        <w:t xml:space="preserve">ano da edição consultada</w:t>
-      </w:r>
-      <w:r>
-        <w:t xml:space="preserve">.</w:t>
+        <w:t xml:space="preserve">: teoria geral, comentários aos arts. 1º a 5º da Constituição da República Federativa do Brasil, doutrina e jurisprudência. 9. ed. São Paulo: Atlas, 2011.</w:t>
       </w:r>
     </w:p>
     <w:p>

</xml_diff>

<commit_message>
Separa a metodologia da introdução no artigo revisado
Co-Authored-By: Claude Opus 5.5 <noreply@anthropic.com>
Claude-Session: https://claude.ai/code/session_01Vi1tdgL3vLX1QkqSfDtEvG
</commit_message>
<xml_diff>
--- a/T.AV1 - ALUNA Gabriele de Oliveira Diubate - VERSAO REVISADA.docx
+++ b/T.AV1 - ALUNA Gabriele de Oliveira Diubate - VERSAO REVISADA.docx
@@ -139,7 +139,29 @@
         <w:jc w:val="both"/>
       </w:pPr>
       <w:r>
-        <w:t xml:space="preserve">Quanto à metodologia, a pesquisa é qualitativa e utiliza o método dedutivo: parte das normas gerais e dos precedentes obrigatórios para verificar como eles são aplicados em casos concretos do Paraná. Foram usadas pesquisa bibliográfica, sobre o direito à saúde e a judicialização, e pesquisa documental, que abrangeu a Constituição Federal, a Lei nº 8.080/1990, o guia prático do Conselho Nacional de Justiça (CNJ) sobre os Temas 6 e 1234, o Tema 106 do Superior Tribunal de Justiça (STJ), os Temas 6, 793 e 1234 do STF e as Súmulas Vinculantes nº 60 e 61.</w:t>
+        <w:t xml:space="preserve">Após esta introdução e a exposição da metodologia, o artigo se divide em três partes. A primeira trata do fundamento constitucional do direito à saúde e da organização do SUS. A segunda explica os critérios fixados pelo STJ e pelo STF. A terceira analisa os julgados do TJPR e discute, a partir deles, se os critérios racionalizam a judicialização ou dificultam o acesso ao tratamento.</w:t>
+      </w:r>
+    </w:p>
+    <w:p>
+      <w:pPr>
+        <w:spacing w:after="240" w:before="360" w:line="360"/>
+      </w:pPr>
+      <w:r>
+        <w:rPr>
+          <w:b/>
+          <w:bCs/>
+        </w:rPr>
+        <w:t xml:space="preserve">METODOLOGIA</w:t>
+      </w:r>
+    </w:p>
+    <w:p>
+      <w:pPr>
+        <w:spacing w:after="0" w:line="360"/>
+        <w:ind w:firstLine="709"/>
+        <w:jc w:val="both"/>
+      </w:pPr>
+      <w:r>
+        <w:t xml:space="preserve">A pesquisa é qualitativa e utiliza o método dedutivo: parte das normas gerais e dos precedentes obrigatórios para verificar como eles são aplicados em casos concretos do Paraná. Foram usadas pesquisa bibliográfica, sobre o direito à saúde e a judicialização, e pesquisa documental, que abrangeu a Constituição Federal, a Lei nº 8.080/1990, o guia prático do Conselho Nacional de Justiça (CNJ) sobre os Temas 6 e 1234, o Tema 106 do Superior Tribunal de Justiça (STJ), os Temas 6, 793 e 1234 do STF e as Súmulas Vinculantes nº 60 e 61.</w:t>
       </w:r>
     </w:p>
     <w:p>
@@ -150,16 +172,6 @@
       </w:pPr>
       <w:r>
         <w:t xml:space="preserve">A seleção dos julgados do TJPR foi feita por meio de pesquisa de jurisprudência na plataforma JusBrasil, com termos relacionados aos Temas 6 e 1234 do STF e ao fornecimento de medicamentos pelo SUS, considerando decisões proferidas entre abril de 2025 e abril de 2026, ou seja, depois da publicação das teses do STF. Entre os resultados encontrados, foram escolhidos cinco acórdãos, com base em três critérios: (a) a decisão precisava aplicar ou afastar expressamente os Temas 6 e/ou 1234; (b) a ação precisava ter sido proposta contra o Poder Público, pedindo medicamento ao SUS, o que excluiu os casos envolvendo planos de saúde; e (c) o conjunto precisava reunir situações diferentes — medicamento não incorporado com pedido negado, medicamento não incorporado com pedido concedido e medicamento já incorporado —, para permitir comparar os resultados. Os casos estão resumidos no Quadro 1, na seção 3.</w:t>
-      </w:r>
-    </w:p>
-    <w:p>
-      <w:pPr>
-        <w:spacing w:after="0" w:line="360"/>
-        <w:ind w:firstLine="709"/>
-        <w:jc w:val="both"/>
-      </w:pPr>
-      <w:r>
-        <w:t xml:space="preserve">O artigo está dividido em três partes. A primeira trata do fundamento constitucional do direito à saúde e da organização do SUS. A segunda explica os critérios fixados pelo STJ e pelo STF. A terceira analisa os julgados do TJPR e discute, a partir deles, se os critérios racionalizam a judicialização ou dificultam o acesso ao tratamento.</w:t>
       </w:r>
     </w:p>
     <w:p>

</xml_diff>